<commit_message>
disclaimer and footer chaning
</commit_message>
<xml_diff>
--- a/Part one documentation.docx
+++ b/Part one documentation.docx
@@ -1,6 +1,6 @@
 
 <file path=word/document.xml><?xml version="1.0" encoding="utf-8"?>
-<w:document xmlns:wpc="http://schemas.microsoft.com/office/word/2010/wordprocessingCanvas" xmlns:cx="http://schemas.microsoft.com/office/drawing/2014/chartex" xmlns:cx1="http://schemas.microsoft.com/office/drawing/2015/9/8/chartex" xmlns:cx2="http://schemas.microsoft.com/office/drawing/2015/10/21/chartex" xmlns:cx3="http://schemas.microsoft.com/office/drawing/2016/5/9/chartex" xmlns:cx4="http://schemas.microsoft.com/office/drawing/2016/5/10/chartex" xmlns:cx5="http://schemas.microsoft.com/office/drawing/2016/5/11/chartex" xmlns:cx6="http://schemas.microsoft.com/office/drawing/2016/5/12/chartex" xmlns:cx7="http://schemas.microsoft.com/office/drawing/2016/5/13/chartex" xmlns:cx8="http://schemas.microsoft.com/office/drawing/2016/5/14/chartex" xmlns:mc="http://schemas.openxmlformats.org/markup-compatibility/2006" xmlns:aink="http://schemas.microsoft.com/office/drawing/2016/ink" xmlns:am3d="http://schemas.microsoft.com/office/drawing/2017/model3d" xmlns:o="urn:schemas-microsoft-com:office:office" xmlns:oel="http://schemas.microsoft.com/office/2019/extlst" xmlns:r="http://schemas.openxmlformats.org/officeDocument/2006/relationships" xmlns:m="http://schemas.openxmlformats.org/officeDocument/2006/math" xmlns:v="urn:schemas-microsoft-com:vml" xmlns:wp14="http://schemas.microsoft.com/office/word/2010/wordprocessingDrawing" xmlns:wp="http://schemas.openxmlformats.org/drawingml/2006/wordprocessingDrawing" xmlns:w10="urn:schemas-microsoft-com:office:word" xmlns:w="http://schemas.openxmlformats.org/wordprocessingml/2006/main" xmlns:w14="http://schemas.microsoft.com/office/word/2010/wordml" xmlns:w15="http://schemas.microsoft.com/office/word/2012/wordml" xmlns:w16cex="http://schemas.microsoft.com/office/word/2018/wordml/cex" xmlns:w16cid="http://schemas.microsoft.com/office/word/2016/wordml/cid" xmlns:w16="http://schemas.microsoft.com/office/word/2018/wordml" xmlns:w16du="http://schemas.microsoft.com/office/word/2023/wordml/word16du" xmlns:w16sdtdh="http://schemas.microsoft.com/office/word/2020/wordml/sdtdatahash" xmlns:w16sdtfl="http://schemas.microsoft.com/office/word/2024/wordml/sdtformatlock" xmlns:w16se="http://schemas.microsoft.com/office/word/2015/wordml/symex" xmlns:wpg="http://schemas.microsoft.com/office/word/2010/wordprocessingGroup" xmlns:wpi="http://schemas.microsoft.com/office/word/2010/wordprocessingInk" xmlns:wne="http://schemas.microsoft.com/office/word/2006/wordml" xmlns:wps="http://schemas.microsoft.com/office/word/2010/wordprocessingShape" mc:Ignorable="w14 w15 w16se w16cid w16 w16cex w16sdtdh w16sdtfl w16du wp14">
+<w:document xmlns:wpc="http://schemas.microsoft.com/office/word/2010/wordprocessingCanvas" xmlns:mc="http://schemas.openxmlformats.org/markup-compatibility/2006" xmlns:o="urn:schemas-microsoft-com:office:office" xmlns:r="http://schemas.openxmlformats.org/officeDocument/2006/relationships" xmlns:m="http://schemas.openxmlformats.org/officeDocument/2006/math" xmlns:v="urn:schemas-microsoft-com:vml" xmlns:wp14="http://schemas.microsoft.com/office/word/2010/wordprocessingDrawing" xmlns:wp="http://schemas.openxmlformats.org/drawingml/2006/wordprocessingDrawing" xmlns:w10="urn:schemas-microsoft-com:office:word" xmlns:w="http://schemas.openxmlformats.org/wordprocessingml/2006/main" xmlns:w14="http://schemas.microsoft.com/office/word/2010/wordml" xmlns:w15="http://schemas.microsoft.com/office/word/2012/wordml" xmlns:wpg="http://schemas.microsoft.com/office/word/2010/wordprocessingGroup" xmlns:wpi="http://schemas.microsoft.com/office/word/2010/wordprocessingInk" xmlns:wne="http://schemas.microsoft.com/office/word/2006/wordml" xmlns:wps="http://schemas.microsoft.com/office/word/2010/wordprocessingShape" mc:Ignorable="w14 w15 wp14">
   <w:body>
     <w:p>
       <w:pPr>
@@ -483,6 +483,8 @@
           <w:rFonts w:ascii="Times New Roman" w:hAnsi="Times New Roman" w:cs="Times New Roman"/>
           <w:b/>
           <w:color w:val="0D0D0D" w:themeColor="text1" w:themeTint="F2"/>
+          <w:sz w:val="28"/>
+          <w:szCs w:val="28"/>
         </w:rPr>
       </w:pPr>
       <w:r>
@@ -490,6 +492,8 @@
           <w:rFonts w:ascii="Times New Roman" w:hAnsi="Times New Roman" w:cs="Times New Roman"/>
           <w:b/>
           <w:color w:val="0D0D0D" w:themeColor="text1" w:themeTint="F2"/>
+          <w:sz w:val="28"/>
+          <w:szCs w:val="28"/>
         </w:rPr>
         <w:lastRenderedPageBreak/>
         <w:t>Project Mission</w:t>
@@ -511,7 +515,53 @@
         <w:t>essential planning tool for exploring Ethiopia</w:t>
       </w:r>
       <w:r>
-        <w:t>, empowering users to create customized, unforgettable tours by providing detailed information, advanced features, and a user-friendly platform.</w:t>
+        <w:t>, empowering users to cre</w:t>
+      </w:r>
+      <w:bookmarkStart w:id="0" w:name="_GoBack"/>
+      <w:bookmarkEnd w:id="0"/>
+      <w:r>
+        <w:t>ate customized, unforgettable tours by providing detailed information, advanced features, and a user-friendly platform.</w:t>
+      </w:r>
+    </w:p>
+    <w:p>
+      <w:pPr>
+        <w:pStyle w:val="NormalWeb"/>
+        <w:spacing w:line="360" w:lineRule="auto"/>
+      </w:pPr>
+      <w:r>
+        <w:rPr>
+          <w:b/>
+          <w:bCs/>
+        </w:rPr>
+        <w:t>Key Services Offered (Based on the HTML Pages):</w:t>
+      </w:r>
+    </w:p>
+    <w:p>
+      <w:pPr>
+        <w:pStyle w:val="Heading4"/>
+        <w:rPr>
+          <w:b/>
+          <w:color w:val="auto"/>
+          <w:sz w:val="28"/>
+          <w:szCs w:val="28"/>
+        </w:rPr>
+      </w:pPr>
+      <w:r>
+        <w:rPr>
+          <w:b/>
+          <w:color w:val="auto"/>
+          <w:sz w:val="28"/>
+          <w:szCs w:val="28"/>
+        </w:rPr>
+        <w:t>index.html (Home)</w:t>
+      </w:r>
+    </w:p>
+    <w:p>
+      <w:pPr>
+        <w:pStyle w:val="NormalWeb"/>
+      </w:pPr>
+      <w:r>
+        <w:t>This is the landing page serving as an introduction to the website.</w:t>
       </w:r>
     </w:p>
     <w:p>
@@ -519,16 +569,122 @@
         <w:pStyle w:val="NormalWeb"/>
         <w:numPr>
           <w:ilvl w:val="0"/>
-          <w:numId w:val="2"/>
+          <w:numId w:val="3"/>
         </w:numPr>
-        <w:spacing w:line="360" w:lineRule="auto"/>
-      </w:pPr>
-      <w:r>
-        <w:rPr>
-          <w:b/>
-          <w:bCs/>
-        </w:rPr>
-        <w:t>Key Services Offered (Based on the HTML Pages):</w:t>
+      </w:pPr>
+      <w:r>
+        <w:rPr>
+          <w:b/>
+          <w:bCs/>
+        </w:rPr>
+        <w:t>Hero Section:</w:t>
+      </w:r>
+      <w:r>
+        <w:t xml:space="preserve"> Features a background image of the Semien Mountains with a call-to-action button to explore destinations.</w:t>
+      </w:r>
+    </w:p>
+    <w:p>
+      <w:pPr>
+        <w:pStyle w:val="NormalWeb"/>
+        <w:numPr>
+          <w:ilvl w:val="0"/>
+          <w:numId w:val="3"/>
+        </w:numPr>
+      </w:pPr>
+      <w:r>
+        <w:rPr>
+          <w:b/>
+          <w:bCs/>
+        </w:rPr>
+        <w:t>Cultural Dances:</w:t>
+      </w:r>
+      <w:r>
+        <w:t xml:space="preserve"> A grid section highlighting traditional dances: Wolaita, Eskista (Amhara), and Oromo.</w:t>
+      </w:r>
+    </w:p>
+    <w:p>
+      <w:pPr>
+        <w:pStyle w:val="NormalWeb"/>
+        <w:numPr>
+          <w:ilvl w:val="0"/>
+          <w:numId w:val="3"/>
+        </w:numPr>
+      </w:pPr>
+      <w:r>
+        <w:rPr>
+          <w:b/>
+          <w:bCs/>
+        </w:rPr>
+        <w:t>Cultural Foods:</w:t>
+      </w:r>
+      <w:r>
+        <w:t xml:space="preserve"> A section showcasing Ethiopian cuisine, specifically Doro wot, Beyayinet, and Tire siga.</w:t>
+      </w:r>
+    </w:p>
+    <w:p>
+      <w:pPr>
+        <w:pStyle w:val="Heading4"/>
+        <w:rPr>
+          <w:b/>
+          <w:color w:val="auto"/>
+          <w:sz w:val="28"/>
+          <w:szCs w:val="28"/>
+        </w:rPr>
+      </w:pPr>
+      <w:r>
+        <w:rPr>
+          <w:b/>
+          <w:color w:val="auto"/>
+          <w:sz w:val="28"/>
+          <w:szCs w:val="28"/>
+        </w:rPr>
+        <w:t>attractions.html (Attractions)</w:t>
+      </w:r>
+    </w:p>
+    <w:p>
+      <w:pPr>
+        <w:pStyle w:val="NormalWeb"/>
+      </w:pPr>
+      <w:r>
+        <w:t>This page details specific tourist destinations within the country.</w:t>
+      </w:r>
+    </w:p>
+    <w:p>
+      <w:pPr>
+        <w:pStyle w:val="NormalWeb"/>
+        <w:numPr>
+          <w:ilvl w:val="0"/>
+          <w:numId w:val="4"/>
+        </w:numPr>
+      </w:pPr>
+      <w:r>
+        <w:rPr>
+          <w:b/>
+          <w:bCs/>
+        </w:rPr>
+        <w:t>Hero Section:</w:t>
+      </w:r>
+      <w:r>
+        <w:t xml:space="preserve"> Features a background image of "Gladababon".</w:t>
+      </w:r>
+    </w:p>
+    <w:p>
+      <w:pPr>
+        <w:pStyle w:val="NormalWeb"/>
+        <w:numPr>
+          <w:ilvl w:val="0"/>
+          <w:numId w:val="4"/>
+        </w:numPr>
+      </w:pPr>
+      <w:r>
+        <w:rPr>
+          <w:b/>
+          <w:bCs/>
+        </w:rPr>
+        <w:t>Top Attractions:</w:t>
+      </w:r>
+      <w:r>
+        <w:t xml:space="preserve"> A 3-column grid displaying cards for major landmarks, including:</w:t>
       </w:r>
     </w:p>
     <w:p>
@@ -536,35 +692,18 @@
         <w:pStyle w:val="NormalWeb"/>
         <w:numPr>
           <w:ilvl w:val="1"/>
-          <w:numId w:val="2"/>
+          <w:numId w:val="4"/>
         </w:numPr>
-        <w:spacing w:line="360" w:lineRule="auto"/>
-      </w:pPr>
-      <w:r>
-        <w:rPr>
-          <w:b/>
-          <w:bCs/>
-        </w:rPr>
-        <w:t>Home (</w:t>
-      </w:r>
-      <w:r>
-        <w:rPr>
-          <w:rStyle w:val="HTMLCode"/>
-          <w:rFonts w:ascii="Times New Roman" w:hAnsi="Times New Roman" w:cs="Times New Roman"/>
-          <w:b/>
-          <w:bCs/>
-        </w:rPr>
-        <w:t>index.html</w:t>
-      </w:r>
-      <w:r>
-        <w:rPr>
-          <w:b/>
-          <w:bCs/>
-        </w:rPr>
-        <w:t>):</w:t>
-      </w:r>
-      <w:r>
-        <w:t xml:space="preserve"> Marketing and high-level feature overview (Details, Features, Pricing, FAQ).</w:t>
+      </w:pPr>
+      <w:r>
+        <w:rPr>
+          <w:b/>
+          <w:bCs/>
+        </w:rPr>
+        <w:t>Historical Sites:</w:t>
+      </w:r>
+      <w:r>
+        <w:t xml:space="preserve"> Lalibela rock-hewn churches, Aksum Obelisk, and Fasilides Castles.</w:t>
       </w:r>
     </w:p>
     <w:p>
@@ -572,35 +711,18 @@
         <w:pStyle w:val="NormalWeb"/>
         <w:numPr>
           <w:ilvl w:val="1"/>
-          <w:numId w:val="2"/>
+          <w:numId w:val="4"/>
         </w:numPr>
-        <w:spacing w:line="360" w:lineRule="auto"/>
-      </w:pPr>
-      <w:r>
-        <w:rPr>
-          <w:b/>
-          <w:bCs/>
-        </w:rPr>
-        <w:t>Search Places (</w:t>
-      </w:r>
-      <w:r>
-        <w:rPr>
-          <w:rStyle w:val="HTMLCode"/>
-          <w:rFonts w:ascii="Times New Roman" w:hAnsi="Times New Roman" w:cs="Times New Roman"/>
-          <w:b/>
-          <w:bCs/>
-        </w:rPr>
-        <w:t>places.html</w:t>
-      </w:r>
-      <w:r>
-        <w:rPr>
-          <w:b/>
-          <w:bCs/>
-        </w:rPr>
-        <w:t>):</w:t>
-      </w:r>
-      <w:r>
-        <w:t xml:space="preserve"> Advanced search and filtering for locations and attractions.</w:t>
+      </w:pPr>
+      <w:r>
+        <w:rPr>
+          <w:b/>
+          <w:bCs/>
+        </w:rPr>
+        <w:t>Natural Wonders:</w:t>
+      </w:r>
+      <w:r>
+        <w:t xml:space="preserve"> Ajora Falls, Semien Mountains, and the Danakil Depression.</w:t>
       </w:r>
     </w:p>
     <w:p>
@@ -608,35 +730,288 @@
         <w:pStyle w:val="NormalWeb"/>
         <w:numPr>
           <w:ilvl w:val="1"/>
-          <w:numId w:val="2"/>
+          <w:numId w:val="4"/>
         </w:numPr>
-        <w:spacing w:line="360" w:lineRule="auto"/>
-      </w:pPr>
-      <w:r>
-        <w:rPr>
-          <w:b/>
-          <w:bCs/>
-        </w:rPr>
-        <w:t>Tour planning (</w:t>
+      </w:pPr>
+      <w:r>
+        <w:rPr>
+          <w:b/>
+          <w:bCs/>
+        </w:rPr>
+        <w:t>Modern/Wild:</w:t>
+      </w:r>
+      <w:r>
+        <w:t xml:space="preserve"> The GERD Dam and endemic wildlife like the Walia Ibex.</w:t>
+      </w:r>
+    </w:p>
+    <w:p>
+      <w:pPr>
+        <w:pStyle w:val="Heading4"/>
+        <w:rPr>
+          <w:b/>
+          <w:sz w:val="28"/>
+          <w:szCs w:val="28"/>
+        </w:rPr>
+      </w:pPr>
+      <w:r>
+        <w:rPr>
+          <w:b/>
+          <w:color w:val="auto"/>
+          <w:sz w:val="28"/>
+          <w:szCs w:val="28"/>
+        </w:rPr>
+        <w:t>culture.html (Culture)</w:t>
+      </w:r>
+    </w:p>
+    <w:p>
+      <w:pPr>
+        <w:pStyle w:val="NormalWeb"/>
+      </w:pPr>
+      <w:r>
+        <w:t>This page focuses on traditions and festivals.</w:t>
+      </w:r>
+    </w:p>
+    <w:p>
+      <w:pPr>
+        <w:pStyle w:val="NormalWeb"/>
+        <w:numPr>
+          <w:ilvl w:val="0"/>
+          <w:numId w:val="5"/>
+        </w:numPr>
+      </w:pPr>
+      <w:r>
+        <w:rPr>
+          <w:b/>
+          <w:bCs/>
+        </w:rPr>
+        <w:t>Unique Script:</w:t>
+      </w:r>
+      <w:r>
+        <w:t xml:space="preserve"> Unlike other pages, this file contains an inline script at the top to handle a specific "img-popup" modal, in addition to the standard lightbox at the bottom.</w:t>
+      </w:r>
+    </w:p>
+    <w:p>
+      <w:pPr>
+        <w:pStyle w:val="NormalWeb"/>
+        <w:numPr>
+          <w:ilvl w:val="0"/>
+          <w:numId w:val="5"/>
+        </w:numPr>
+      </w:pPr>
+      <w:r>
+        <w:rPr>
+          <w:b/>
+          <w:bCs/>
+        </w:rPr>
+        <w:t>Hero Section:</w:t>
+      </w:r>
+      <w:r>
+        <w:t xml:space="preserve"> Features a coffee-themed background.</w:t>
+      </w:r>
+    </w:p>
+    <w:p>
+      <w:pPr>
+        <w:pStyle w:val="NormalWeb"/>
+        <w:numPr>
+          <w:ilvl w:val="0"/>
+          <w:numId w:val="5"/>
+        </w:numPr>
+      </w:pPr>
+      <w:r>
+        <w:rPr>
+          <w:b/>
+          <w:bCs/>
+        </w:rPr>
+        <w:t>Highlights:</w:t>
+      </w:r>
+      <w:r>
+        <w:t xml:space="preserve"> Displays a grid focusing on the Coffee Ceremony, Timkat (Epiphany) festival, and traditional regional festivals.</w:t>
+      </w:r>
+    </w:p>
+    <w:p>
+      <w:pPr>
+        <w:pStyle w:val="Heading4"/>
+        <w:rPr>
+          <w:b/>
+          <w:color w:val="auto"/>
+          <w:sz w:val="28"/>
+          <w:szCs w:val="28"/>
+        </w:rPr>
+      </w:pPr>
+      <w:r>
+        <w:rPr>
+          <w:b/>
+          <w:color w:val="auto"/>
+          <w:sz w:val="28"/>
+          <w:szCs w:val="28"/>
+        </w:rPr>
+        <w:lastRenderedPageBreak/>
+        <w:t>About.html (About)</w:t>
+      </w:r>
+    </w:p>
+    <w:p>
+      <w:pPr>
+        <w:pStyle w:val="NormalWeb"/>
+      </w:pPr>
+      <w:r>
+        <w:t>This page provides educational context regarding the nation.</w:t>
+      </w:r>
+    </w:p>
+    <w:p>
+      <w:pPr>
+        <w:pStyle w:val="NormalWeb"/>
+        <w:numPr>
+          <w:ilvl w:val="0"/>
+          <w:numId w:val="6"/>
+        </w:numPr>
+      </w:pPr>
+      <w:r>
+        <w:rPr>
+          <w:b/>
+          <w:bCs/>
+        </w:rPr>
+        <w:t>Information Grid:</w:t>
+      </w:r>
+      <w:r>
+        <w:t xml:space="preserve"> Sections covering History (ancient civilizations like Aksum), Geography (Highlands and Blue Nile), and People/Languages (120+ ethnic groups).</w:t>
+      </w:r>
+    </w:p>
+    <w:p>
+      <w:pPr>
+        <w:pStyle w:val="NormalWeb"/>
+        <w:numPr>
+          <w:ilvl w:val="0"/>
+          <w:numId w:val="6"/>
+        </w:numPr>
+      </w:pPr>
+      <w:r>
+        <w:rPr>
+          <w:b/>
+          <w:bCs/>
+        </w:rPr>
+        <w:t>Map Integration:</w:t>
+      </w:r>
+      <w:r>
+        <w:t xml:space="preserve"> Embeds a Google Map via an </w:t>
       </w:r>
       <w:r>
         <w:rPr>
           <w:rStyle w:val="HTMLCode"/>
-          <w:rFonts w:ascii="Times New Roman" w:hAnsi="Times New Roman" w:cs="Times New Roman"/>
-          <w:b/>
-          <w:bCs/>
-        </w:rPr>
-        <w:t>tour-planning.html</w:t>
-      </w:r>
-      <w:r>
-        <w:rPr>
-          <w:b/>
-          <w:bCs/>
-        </w:rPr>
-        <w:t>):</w:t>
-      </w:r>
-      <w:r>
-        <w:t xml:space="preserve"> Custom itinerary creation (currently represented by the Pricing model, suggesting this is a premium feature).</w:t>
+        </w:rPr>
+        <w:t>iframe</w:t>
+      </w:r>
+      <w:r>
+        <w:t xml:space="preserve"> to visualize the country's location.</w:t>
+      </w:r>
+    </w:p>
+    <w:p>
+      <w:pPr>
+        <w:pStyle w:val="Heading4"/>
+        <w:rPr>
+          <w:b/>
+          <w:color w:val="auto"/>
+          <w:sz w:val="28"/>
+          <w:szCs w:val="28"/>
+        </w:rPr>
+      </w:pPr>
+      <w:r>
+        <w:rPr>
+          <w:b/>
+          <w:color w:val="auto"/>
+          <w:sz w:val="28"/>
+          <w:szCs w:val="28"/>
+        </w:rPr>
+        <w:t>tips_contact.html (Travel Tips)</w:t>
+      </w:r>
+    </w:p>
+    <w:p>
+      <w:pPr>
+        <w:pStyle w:val="NormalWeb"/>
+      </w:pPr>
+      <w:r>
+        <w:t>This is the most technically complex page, handling user input and interactions.</w:t>
+      </w:r>
+    </w:p>
+    <w:p>
+      <w:pPr>
+        <w:pStyle w:val="NormalWeb"/>
+        <w:numPr>
+          <w:ilvl w:val="0"/>
+          <w:numId w:val="7"/>
+        </w:numPr>
+      </w:pPr>
+      <w:r>
+        <w:rPr>
+          <w:b/>
+          <w:bCs/>
+        </w:rPr>
+        <w:t>Travel Tips:</w:t>
+      </w:r>
+      <w:r>
+        <w:t xml:space="preserve"> A list of advice regarding visas, customs, altitude sickness, and guides.</w:t>
+      </w:r>
+    </w:p>
+    <w:p>
+      <w:pPr>
+        <w:pStyle w:val="NormalWeb"/>
+        <w:numPr>
+          <w:ilvl w:val="0"/>
+          <w:numId w:val="7"/>
+        </w:numPr>
+      </w:pPr>
+      <w:r>
+        <w:rPr>
+          <w:b/>
+          <w:bCs/>
+        </w:rPr>
+        <w:t>Contact Form:</w:t>
+      </w:r>
+      <w:r>
+        <w:t xml:space="preserve"> A detailed form for inquiries including Name, Email, Trip Duration, and Destinations. It uses JavaScript to fetch a list of countries from </w:t>
+      </w:r>
+      <w:r>
+        <w:rPr>
+          <w:rStyle w:val="HTMLCode"/>
+        </w:rPr>
+        <w:t>restcountries.com</w:t>
+      </w:r>
+      <w:r>
+        <w:t xml:space="preserve"> to populate the "Country" dropdown.</w:t>
+      </w:r>
+    </w:p>
+    <w:p>
+      <w:pPr>
+        <w:pStyle w:val="NormalWeb"/>
+        <w:numPr>
+          <w:ilvl w:val="0"/>
+          <w:numId w:val="7"/>
+        </w:numPr>
+      </w:pPr>
+      <w:r>
+        <w:rPr>
+          <w:b/>
+          <w:bCs/>
+        </w:rPr>
+        <w:t>Hotel Section:</w:t>
+      </w:r>
+      <w:r>
+        <w:t xml:space="preserve"> Lists three recommended hotels (Skylight, Hilton, Mariot) with "Book Now" links.</w:t>
+      </w:r>
+    </w:p>
+    <w:p>
+      <w:pPr>
+        <w:pStyle w:val="NormalWeb"/>
+        <w:numPr>
+          <w:ilvl w:val="0"/>
+          <w:numId w:val="7"/>
+        </w:numPr>
+      </w:pPr>
+      <w:r>
+        <w:rPr>
+          <w:b/>
+          <w:bCs/>
+        </w:rPr>
+        <w:t>Booking System (Modals):</w:t>
       </w:r>
     </w:p>
     <w:p>
@@ -644,35 +1019,18 @@
         <w:pStyle w:val="NormalWeb"/>
         <w:numPr>
           <w:ilvl w:val="1"/>
-          <w:numId w:val="2"/>
+          <w:numId w:val="7"/>
         </w:numPr>
-        <w:spacing w:line="360" w:lineRule="auto"/>
-      </w:pPr>
-      <w:r>
-        <w:rPr>
-          <w:b/>
-          <w:bCs/>
-        </w:rPr>
-        <w:t>Blog Post (</w:t>
-      </w:r>
-      <w:r>
-        <w:rPr>
-          <w:rStyle w:val="HTMLCode"/>
-          <w:rFonts w:ascii="Times New Roman" w:hAnsi="Times New Roman" w:cs="Times New Roman"/>
-          <w:b/>
-          <w:bCs/>
-        </w:rPr>
-        <w:t>blog-post.html</w:t>
-      </w:r>
-      <w:r>
-        <w:rPr>
-          <w:b/>
-          <w:bCs/>
-        </w:rPr>
-        <w:t>):</w:t>
-      </w:r>
-      <w:r>
-        <w:t xml:space="preserve"> some blog related to Ethiopia</w:t>
+      </w:pPr>
+      <w:r>
+        <w:rPr>
+          <w:b/>
+          <w:bCs/>
+        </w:rPr>
+        <w:t>Booking Modal:</w:t>
+      </w:r>
+      <w:r>
+        <w:t xml:space="preserve"> A popup form that captures user details and dates when a hotel is selected.</w:t>
       </w:r>
     </w:p>
     <w:p>
@@ -680,36 +1038,45 @@
         <w:pStyle w:val="NormalWeb"/>
         <w:numPr>
           <w:ilvl w:val="1"/>
-          <w:numId w:val="2"/>
+          <w:numId w:val="7"/>
         </w:numPr>
+      </w:pPr>
+      <w:r>
+        <w:rPr>
+          <w:b/>
+          <w:bCs/>
+        </w:rPr>
+        <w:t>Payment Modal:</w:t>
+      </w:r>
+      <w:r>
+        <w:t xml:space="preserve"> A secondary popup that simulates payment processing via Credit Card or PayPal.</w:t>
+      </w:r>
+    </w:p>
+    <w:p>
+      <w:pPr>
+        <w:pStyle w:val="NormalWeb"/>
+        <w:numPr>
+          <w:ilvl w:val="1"/>
+          <w:numId w:val="7"/>
+        </w:numPr>
+      </w:pPr>
+      <w:r>
+        <w:rPr>
+          <w:b/>
+          <w:bCs/>
+        </w:rPr>
+        <w:t>Scripting:</w:t>
+      </w:r>
+      <w:r>
+        <w:t xml:space="preserve"> Contains extensive internal JavaScript to handle modal opening/closing, form validation, and simulated payment success messages.</w:t>
+      </w:r>
+    </w:p>
+    <w:p>
+      <w:pPr>
+        <w:pStyle w:val="NormalWeb"/>
         <w:spacing w:line="360" w:lineRule="auto"/>
-      </w:pPr>
-      <w:r>
-        <w:rPr>
-          <w:b/>
-          <w:bCs/>
-        </w:rPr>
-        <w:t>Authentication (</w:t>
-      </w:r>
-      <w:r>
-        <w:rPr>
-          <w:rStyle w:val="HTMLCode"/>
-          <w:rFonts w:ascii="Times New Roman" w:hAnsi="Times New Roman" w:cs="Times New Roman"/>
-          <w:b/>
-          <w:bCs/>
-        </w:rPr>
-        <w:t>login.html</w:t>
-      </w:r>
-      <w:r>
-        <w:rPr>
-          <w:b/>
-          <w:bCs/>
-        </w:rPr>
-        <w:t>):</w:t>
-      </w:r>
-      <w:r>
-        <w:t xml:space="preserve"> Secure login and registration to save user plans and access premium features.</w:t>
-      </w:r>
+        <w:ind w:left="1080"/>
+      </w:pPr>
     </w:p>
     <w:p>
       <w:pPr>
@@ -764,7 +1131,16 @@
           <w:sz w:val="24"/>
           <w:szCs w:val="24"/>
         </w:rPr>
-        <w:t>The primary focus of our developing site lies in the functionality of the page. It involves a comprehensive assessment of both the front-end experience and the overall website layout. Our main challenge lies in effectively choosing and implementing a CSS framework that complements captivating imagery. This strategic combination aims to enhance user accessibility for travelers visiting the page. The content will primarily cover vital information regarding current investment sectors, economic advancements, and other key factors that underscore the region's economic stability and attractiveness.</w:t>
+        <w:t xml:space="preserve">The primary focus of our developing site lies in the functionality of the page. It involves a comprehensive assessment of both the front-end experience and the overall website layout. Our main challenge lies in effectively choosing and implementing a CSS framework that complements captivating imagery. This strategic combination aims to enhance user accessibility for travelers visiting the page. The content will primarily cover vital information regarding </w:t>
+      </w:r>
+      <w:r>
+        <w:rPr>
+          <w:rFonts w:ascii="Times New Roman" w:hAnsi="Times New Roman" w:cs="Times New Roman"/>
+          <w:sz w:val="24"/>
+          <w:szCs w:val="24"/>
+        </w:rPr>
+        <w:lastRenderedPageBreak/>
+        <w:t>current investment sectors, economic advancements, and other key factors that underscore the region's economic stability and attractiveness.</w:t>
       </w:r>
     </w:p>
     <w:p>
@@ -782,16 +1158,7 @@
           <w:sz w:val="24"/>
           <w:szCs w:val="24"/>
         </w:rPr>
-        <w:t xml:space="preserve">Within the system, users fall into two distinct categories: guests and administrators. The system's behavior will distinctly cater to these user categories due to their separate roles and access levels. The core emphasis of this front-end project revolves around optimizing the page layout and its </w:t>
-      </w:r>
-      <w:r>
-        <w:rPr>
-          <w:rFonts w:ascii="Times New Roman" w:hAnsi="Times New Roman" w:cs="Times New Roman"/>
-          <w:sz w:val="24"/>
-          <w:szCs w:val="24"/>
-        </w:rPr>
-        <w:lastRenderedPageBreak/>
-        <w:t>structural organization. Eventually, a server-side project will enable the complete set of web page functionalities.</w:t>
+        <w:t>Within the system, users fall into two distinct categories: guests and administrators. The system's behavior will distinctly cater to these user categories due to their separate roles and access levels. The core emphasis of this front-end project revolves around optimizing the page layout and its structural organization. Eventually, a server-side project will enable the complete set of web page functionalities.</w:t>
       </w:r>
     </w:p>
     <w:p>
@@ -881,27 +1248,15 @@
           <w:rFonts w:ascii="Times New Roman" w:hAnsi="Times New Roman" w:cs="Times New Roman"/>
         </w:rPr>
       </w:pPr>
-      <w:proofErr w:type="spellStart"/>
-      <w:r>
-        <w:rPr>
-          <w:rFonts w:ascii="Times New Roman" w:hAnsi="Times New Roman" w:cs="Times New Roman"/>
-          <w:b/>
-          <w:bCs/>
-          <w:sz w:val="24"/>
-          <w:szCs w:val="24"/>
-        </w:rPr>
-        <w:t>Drawio</w:t>
-      </w:r>
-      <w:proofErr w:type="spellEnd"/>
-      <w:r>
-        <w:rPr>
-          <w:rFonts w:ascii="Times New Roman" w:hAnsi="Times New Roman" w:cs="Times New Roman"/>
-          <w:b/>
-          <w:bCs/>
-          <w:sz w:val="24"/>
-          <w:szCs w:val="24"/>
-        </w:rPr>
-        <w:t>:</w:t>
+      <w:r>
+        <w:rPr>
+          <w:rFonts w:ascii="Times New Roman" w:hAnsi="Times New Roman" w:cs="Times New Roman"/>
+          <w:b/>
+          <w:bCs/>
+          <w:sz w:val="24"/>
+          <w:szCs w:val="24"/>
+        </w:rPr>
+        <w:t>Drawio:</w:t>
       </w:r>
       <w:r>
         <w:rPr>
@@ -917,25 +1272,7 @@
           <w:sz w:val="24"/>
           <w:szCs w:val="24"/>
         </w:rPr>
-        <w:t xml:space="preserve">Creating the site map for our proposed web page was achieved using the user-friendly and free </w:t>
-      </w:r>
-      <w:proofErr w:type="spellStart"/>
-      <w:r>
-        <w:rPr>
-          <w:rFonts w:ascii="Times New Roman" w:hAnsi="Times New Roman" w:cs="Times New Roman"/>
-          <w:sz w:val="24"/>
-          <w:szCs w:val="24"/>
-        </w:rPr>
-        <w:t>Drawio</w:t>
-      </w:r>
-      <w:proofErr w:type="spellEnd"/>
-      <w:r>
-        <w:rPr>
-          <w:rFonts w:ascii="Times New Roman" w:hAnsi="Times New Roman" w:cs="Times New Roman"/>
-          <w:sz w:val="24"/>
-          <w:szCs w:val="24"/>
-        </w:rPr>
-        <w:t xml:space="preserve"> tool, simplifying the process of crafting line drawings.</w:t>
+        <w:t>Creating the site map for our proposed web page was achieved using the user-friendly and free Drawio tool, simplifying the process of crafting line drawings.</w:t>
       </w:r>
     </w:p>
     <w:p>
@@ -971,25 +1308,7 @@
           <w:sz w:val="24"/>
           <w:szCs w:val="24"/>
         </w:rPr>
-        <w:t>As the fundamental building block of the Web, HTML defines the structure of web content. Various HTML elements are employed to structure our project's web pages. For instance, the HTML element '</w:t>
-      </w:r>
-      <w:proofErr w:type="spellStart"/>
-      <w:r>
-        <w:rPr>
-          <w:rFonts w:ascii="Times New Roman" w:hAnsi="Times New Roman" w:cs="Times New Roman"/>
-          <w:sz w:val="24"/>
-          <w:szCs w:val="24"/>
-        </w:rPr>
-        <w:t>iframe</w:t>
-      </w:r>
-      <w:proofErr w:type="spellEnd"/>
-      <w:r>
-        <w:rPr>
-          <w:rFonts w:ascii="Times New Roman" w:hAnsi="Times New Roman" w:cs="Times New Roman"/>
-          <w:sz w:val="24"/>
-          <w:szCs w:val="24"/>
-        </w:rPr>
-        <w:t>' embeds another HTML page within the current page.</w:t>
+        <w:t>As the fundamental building block of the Web, HTML defines the structure of web content. Various HTML elements are employed to structure our project's web pages. For instance, the HTML element 'iframe' embeds another HTML page within the current page.</w:t>
       </w:r>
     </w:p>
     <w:p>
@@ -1041,15 +1360,8 @@
           <w:b/>
           <w:bCs/>
         </w:rPr>
-        <w:t>JavaScript</w:t>
-      </w:r>
-      <w:r>
-        <w:rPr>
-          <w:rFonts w:ascii="Times New Roman" w:hAnsi="Times New Roman" w:cs="Times New Roman"/>
-          <w:b/>
-          <w:bCs/>
-        </w:rPr>
-        <w:t xml:space="preserve"> : </w:t>
+        <w:lastRenderedPageBreak/>
+        <w:t xml:space="preserve">JavaScript : </w:t>
       </w:r>
       <w:r>
         <w:rPr>
@@ -1098,7 +1410,6 @@
           <w:sz w:val="24"/>
           <w:szCs w:val="24"/>
         </w:rPr>
-        <w:lastRenderedPageBreak/>
         <w:t>The site map illustrates a comprehensive list of pages intended for the proposed website. Utilizing Draw.io, we crafted the following site map to offer an initial overview of the web page's structure before delving into the wireframe design. Take a look at the site map for our proposed website below, providing a foundational idea of the web page's layout and navigation</w:t>
       </w:r>
       <w:r>
@@ -1441,16 +1752,25 @@
           <w:szCs w:val="24"/>
         </w:rPr>
         <w:lastRenderedPageBreak/>
-        <w:t>Wireframe of mobile version</w:t>
-      </w:r>
-      <w:r>
-        <w:rPr>
-          <w:b/>
-          <w:bCs/>
-          <w:sz w:val="24"/>
-          <w:szCs w:val="24"/>
-        </w:rPr>
-        <w:t xml:space="preserve">  : </w:t>
+        <w:t xml:space="preserve">Wireframe of mobile </w:t>
+      </w:r>
+      <w:r>
+        <w:rPr>
+          <w:b/>
+          <w:bCs/>
+          <w:sz w:val="24"/>
+          <w:szCs w:val="24"/>
+        </w:rPr>
+        <w:t>version:</w:t>
+      </w:r>
+      <w:r>
+        <w:rPr>
+          <w:b/>
+          <w:bCs/>
+          <w:sz w:val="24"/>
+          <w:szCs w:val="24"/>
+        </w:rPr>
+        <w:t xml:space="preserve"> </w:t>
       </w:r>
       <w:r>
         <w:rPr>
@@ -1473,9 +1793,9 @@
         <w:rPr>
           <w:b/>
           <w:bCs/>
-          <w:sz w:val="24"/>
-          <w:szCs w:val="24"/>
-          <w:lang w:val="en-GB"/>
+          <w:noProof/>
+          <w:sz w:val="24"/>
+          <w:szCs w:val="24"/>
         </w:rPr>
         <w:drawing>
           <wp:inline distT="0" distB="0" distL="0" distR="0" wp14:anchorId="343EC059" wp14:editId="21661958">
@@ -1564,17 +1884,7 @@
           <w:sz w:val="24"/>
           <w:szCs w:val="24"/>
         </w:rPr>
-        <w:t>:</w:t>
-      </w:r>
-      <w:r>
-        <w:rPr>
-          <w:rFonts w:ascii="Times New Roman" w:hAnsi="Times New Roman" w:cs="Times New Roman"/>
-          <w:b/>
-          <w:bCs/>
-          <w:sz w:val="24"/>
-          <w:szCs w:val="24"/>
-        </w:rPr>
-        <w:t xml:space="preserve"> </w:t>
+        <w:t xml:space="preserve">: </w:t>
       </w:r>
       <w:r>
         <w:rPr>
@@ -1608,9 +1918,9 @@
         <w:rPr>
           <w:b/>
           <w:bCs/>
-          <w:sz w:val="24"/>
-          <w:szCs w:val="24"/>
-          <w:lang w:val="en-GB"/>
+          <w:noProof/>
+          <w:sz w:val="24"/>
+          <w:szCs w:val="24"/>
         </w:rPr>
         <w:drawing>
           <wp:inline distT="0" distB="0" distL="0" distR="0" wp14:anchorId="0C6B7E86" wp14:editId="45D61C7F">
@@ -1859,7 +2169,27 @@
           <w:szCs w:val="24"/>
         </w:rPr>
         <w:lastRenderedPageBreak/>
-        <w:t xml:space="preserve">Wireframe of Tablet version : </w:t>
+        <w:t xml:space="preserve">Wireframe of Tablet </w:t>
+      </w:r>
+      <w:r>
+        <w:rPr>
+          <w:rFonts w:ascii="Times New Roman" w:hAnsi="Times New Roman" w:cs="Times New Roman"/>
+          <w:b/>
+          <w:bCs/>
+          <w:sz w:val="24"/>
+          <w:szCs w:val="24"/>
+        </w:rPr>
+        <w:t>version:</w:t>
+      </w:r>
+      <w:r>
+        <w:rPr>
+          <w:rFonts w:ascii="Times New Roman" w:hAnsi="Times New Roman" w:cs="Times New Roman"/>
+          <w:b/>
+          <w:bCs/>
+          <w:sz w:val="24"/>
+          <w:szCs w:val="24"/>
+        </w:rPr>
+        <w:t xml:space="preserve"> </w:t>
       </w:r>
       <w:r>
         <w:rPr>
@@ -1890,9 +2220,9 @@
       </w:pPr>
       <w:r>
         <w:rPr>
-          <w:sz w:val="24"/>
-          <w:szCs w:val="24"/>
-          <w:lang w:val="en-GB"/>
+          <w:noProof/>
+          <w:sz w:val="24"/>
+          <w:szCs w:val="24"/>
         </w:rPr>
         <w:drawing>
           <wp:inline distT="0" distB="0" distL="0" distR="0" wp14:anchorId="39B42BE3" wp14:editId="57EDD66F">
@@ -2500,7 +2830,7 @@
 </file>
 
 <file path=word/endnotes.xml><?xml version="1.0" encoding="utf-8"?>
-<w:endnotes xmlns:wpc="http://schemas.microsoft.com/office/word/2010/wordprocessingCanvas" xmlns:cx="http://schemas.microsoft.com/office/drawing/2014/chartex" xmlns:cx1="http://schemas.microsoft.com/office/drawing/2015/9/8/chartex" xmlns:cx2="http://schemas.microsoft.com/office/drawing/2015/10/21/chartex" xmlns:cx3="http://schemas.microsoft.com/office/drawing/2016/5/9/chartex" xmlns:cx4="http://schemas.microsoft.com/office/drawing/2016/5/10/chartex" xmlns:cx5="http://schemas.microsoft.com/office/drawing/2016/5/11/chartex" xmlns:cx6="http://schemas.microsoft.com/office/drawing/2016/5/12/chartex" xmlns:cx7="http://schemas.microsoft.com/office/drawing/2016/5/13/chartex" xmlns:cx8="http://schemas.microsoft.com/office/drawing/2016/5/14/chartex" xmlns:mc="http://schemas.openxmlformats.org/markup-compatibility/2006" xmlns:aink="http://schemas.microsoft.com/office/drawing/2016/ink" xmlns:am3d="http://schemas.microsoft.com/office/drawing/2017/model3d" xmlns:o="urn:schemas-microsoft-com:office:office" xmlns:oel="http://schemas.microsoft.com/office/2019/extlst" xmlns:r="http://schemas.openxmlformats.org/officeDocument/2006/relationships" xmlns:m="http://schemas.openxmlformats.org/officeDocument/2006/math" xmlns:v="urn:schemas-microsoft-com:vml" xmlns:wp14="http://schemas.microsoft.com/office/word/2010/wordprocessingDrawing" xmlns:wp="http://schemas.openxmlformats.org/drawingml/2006/wordprocessingDrawing" xmlns:w10="urn:schemas-microsoft-com:office:word" xmlns:w="http://schemas.openxmlformats.org/wordprocessingml/2006/main" xmlns:w14="http://schemas.microsoft.com/office/word/2010/wordml" xmlns:w15="http://schemas.microsoft.com/office/word/2012/wordml" xmlns:w16cex="http://schemas.microsoft.com/office/word/2018/wordml/cex" xmlns:w16cid="http://schemas.microsoft.com/office/word/2016/wordml/cid" xmlns:w16="http://schemas.microsoft.com/office/word/2018/wordml" xmlns:w16du="http://schemas.microsoft.com/office/word/2023/wordml/word16du" xmlns:w16sdtdh="http://schemas.microsoft.com/office/word/2020/wordml/sdtdatahash" xmlns:w16sdtfl="http://schemas.microsoft.com/office/word/2024/wordml/sdtformatlock" xmlns:w16se="http://schemas.microsoft.com/office/word/2015/wordml/symex" xmlns:wpg="http://schemas.microsoft.com/office/word/2010/wordprocessingGroup" xmlns:wpi="http://schemas.microsoft.com/office/word/2010/wordprocessingInk" xmlns:wne="http://schemas.microsoft.com/office/word/2006/wordml" xmlns:wps="http://schemas.microsoft.com/office/word/2010/wordprocessingShape" mc:Ignorable="w14 w15 w16se w16cid w16 w16cex w16sdtdh w16sdtfl w16du wp14">
+<w:endnotes xmlns:wpc="http://schemas.microsoft.com/office/word/2010/wordprocessingCanvas" xmlns:mc="http://schemas.openxmlformats.org/markup-compatibility/2006" xmlns:o="urn:schemas-microsoft-com:office:office" xmlns:r="http://schemas.openxmlformats.org/officeDocument/2006/relationships" xmlns:m="http://schemas.openxmlformats.org/officeDocument/2006/math" xmlns:v="urn:schemas-microsoft-com:vml" xmlns:wp14="http://schemas.microsoft.com/office/word/2010/wordprocessingDrawing" xmlns:wp="http://schemas.openxmlformats.org/drawingml/2006/wordprocessingDrawing" xmlns:w10="urn:schemas-microsoft-com:office:word" xmlns:w="http://schemas.openxmlformats.org/wordprocessingml/2006/main" xmlns:w14="http://schemas.microsoft.com/office/word/2010/wordml" xmlns:w15="http://schemas.microsoft.com/office/word/2012/wordml" xmlns:wpg="http://schemas.microsoft.com/office/word/2010/wordprocessingGroup" xmlns:wpi="http://schemas.microsoft.com/office/word/2010/wordprocessingInk" xmlns:wne="http://schemas.microsoft.com/office/word/2006/wordml" xmlns:wps="http://schemas.microsoft.com/office/word/2010/wordprocessingShape" mc:Ignorable="w14 w15 wp14">
   <w:endnote w:type="separator" w:id="-1">
     <w:p>
       <w:pPr>
@@ -2525,7 +2855,7 @@
 </file>
 
 <file path=word/footnotes.xml><?xml version="1.0" encoding="utf-8"?>
-<w:footnotes xmlns:wpc="http://schemas.microsoft.com/office/word/2010/wordprocessingCanvas" xmlns:cx="http://schemas.microsoft.com/office/drawing/2014/chartex" xmlns:cx1="http://schemas.microsoft.com/office/drawing/2015/9/8/chartex" xmlns:cx2="http://schemas.microsoft.com/office/drawing/2015/10/21/chartex" xmlns:cx3="http://schemas.microsoft.com/office/drawing/2016/5/9/chartex" xmlns:cx4="http://schemas.microsoft.com/office/drawing/2016/5/10/chartex" xmlns:cx5="http://schemas.microsoft.com/office/drawing/2016/5/11/chartex" xmlns:cx6="http://schemas.microsoft.com/office/drawing/2016/5/12/chartex" xmlns:cx7="http://schemas.microsoft.com/office/drawing/2016/5/13/chartex" xmlns:cx8="http://schemas.microsoft.com/office/drawing/2016/5/14/chartex" xmlns:mc="http://schemas.openxmlformats.org/markup-compatibility/2006" xmlns:aink="http://schemas.microsoft.com/office/drawing/2016/ink" xmlns:am3d="http://schemas.microsoft.com/office/drawing/2017/model3d" xmlns:o="urn:schemas-microsoft-com:office:office" xmlns:oel="http://schemas.microsoft.com/office/2019/extlst" xmlns:r="http://schemas.openxmlformats.org/officeDocument/2006/relationships" xmlns:m="http://schemas.openxmlformats.org/officeDocument/2006/math" xmlns:v="urn:schemas-microsoft-com:vml" xmlns:wp14="http://schemas.microsoft.com/office/word/2010/wordprocessingDrawing" xmlns:wp="http://schemas.openxmlformats.org/drawingml/2006/wordprocessingDrawing" xmlns:w10="urn:schemas-microsoft-com:office:word" xmlns:w="http://schemas.openxmlformats.org/wordprocessingml/2006/main" xmlns:w14="http://schemas.microsoft.com/office/word/2010/wordml" xmlns:w15="http://schemas.microsoft.com/office/word/2012/wordml" xmlns:w16cex="http://schemas.microsoft.com/office/word/2018/wordml/cex" xmlns:w16cid="http://schemas.microsoft.com/office/word/2016/wordml/cid" xmlns:w16="http://schemas.microsoft.com/office/word/2018/wordml" xmlns:w16du="http://schemas.microsoft.com/office/word/2023/wordml/word16du" xmlns:w16sdtdh="http://schemas.microsoft.com/office/word/2020/wordml/sdtdatahash" xmlns:w16sdtfl="http://schemas.microsoft.com/office/word/2024/wordml/sdtformatlock" xmlns:w16se="http://schemas.microsoft.com/office/word/2015/wordml/symex" xmlns:wpg="http://schemas.microsoft.com/office/word/2010/wordprocessingGroup" xmlns:wpi="http://schemas.microsoft.com/office/word/2010/wordprocessingInk" xmlns:wne="http://schemas.microsoft.com/office/word/2006/wordml" xmlns:wps="http://schemas.microsoft.com/office/word/2010/wordprocessingShape" mc:Ignorable="w14 w15 w16se w16cid w16 w16cex w16sdtdh w16sdtfl w16du wp14">
+<w:footnotes xmlns:wpc="http://schemas.microsoft.com/office/word/2010/wordprocessingCanvas" xmlns:mc="http://schemas.openxmlformats.org/markup-compatibility/2006" xmlns:o="urn:schemas-microsoft-com:office:office" xmlns:r="http://schemas.openxmlformats.org/officeDocument/2006/relationships" xmlns:m="http://schemas.openxmlformats.org/officeDocument/2006/math" xmlns:v="urn:schemas-microsoft-com:vml" xmlns:wp14="http://schemas.microsoft.com/office/word/2010/wordprocessingDrawing" xmlns:wp="http://schemas.openxmlformats.org/drawingml/2006/wordprocessingDrawing" xmlns:w10="urn:schemas-microsoft-com:office:word" xmlns:w="http://schemas.openxmlformats.org/wordprocessingml/2006/main" xmlns:w14="http://schemas.microsoft.com/office/word/2010/wordml" xmlns:w15="http://schemas.microsoft.com/office/word/2012/wordml" xmlns:wpg="http://schemas.microsoft.com/office/word/2010/wordprocessingGroup" xmlns:wpi="http://schemas.microsoft.com/office/word/2010/wordprocessingInk" xmlns:wne="http://schemas.microsoft.com/office/word/2006/wordml" xmlns:wps="http://schemas.microsoft.com/office/word/2010/wordprocessingShape" mc:Ignorable="w14 w15 wp14">
   <w:footnote w:type="separator" w:id="-1">
     <w:p>
       <w:pPr>
@@ -2550,8 +2880,157 @@
 </file>
 
 <file path=word/numbering.xml><?xml version="1.0" encoding="utf-8"?>
-<w:numbering xmlns:wpc="http://schemas.microsoft.com/office/word/2010/wordprocessingCanvas" xmlns:cx="http://schemas.microsoft.com/office/drawing/2014/chartex" xmlns:cx1="http://schemas.microsoft.com/office/drawing/2015/9/8/chartex" xmlns:cx2="http://schemas.microsoft.com/office/drawing/2015/10/21/chartex" xmlns:cx3="http://schemas.microsoft.com/office/drawing/2016/5/9/chartex" xmlns:cx4="http://schemas.microsoft.com/office/drawing/2016/5/10/chartex" xmlns:cx5="http://schemas.microsoft.com/office/drawing/2016/5/11/chartex" xmlns:cx6="http://schemas.microsoft.com/office/drawing/2016/5/12/chartex" xmlns:cx7="http://schemas.microsoft.com/office/drawing/2016/5/13/chartex" xmlns:cx8="http://schemas.microsoft.com/office/drawing/2016/5/14/chartex" xmlns:mc="http://schemas.openxmlformats.org/markup-compatibility/2006" xmlns:aink="http://schemas.microsoft.com/office/drawing/2016/ink" xmlns:am3d="http://schemas.microsoft.com/office/drawing/2017/model3d" xmlns:o="urn:schemas-microsoft-com:office:office" xmlns:oel="http://schemas.microsoft.com/office/2019/extlst" xmlns:r="http://schemas.openxmlformats.org/officeDocument/2006/relationships" xmlns:m="http://schemas.openxmlformats.org/officeDocument/2006/math" xmlns:v="urn:schemas-microsoft-com:vml" xmlns:wp14="http://schemas.microsoft.com/office/word/2010/wordprocessingDrawing" xmlns:wp="http://schemas.openxmlformats.org/drawingml/2006/wordprocessingDrawing" xmlns:w10="urn:schemas-microsoft-com:office:word" xmlns:w="http://schemas.openxmlformats.org/wordprocessingml/2006/main" xmlns:w14="http://schemas.microsoft.com/office/word/2010/wordml" xmlns:w15="http://schemas.microsoft.com/office/word/2012/wordml" xmlns:w16cex="http://schemas.microsoft.com/office/word/2018/wordml/cex" xmlns:w16cid="http://schemas.microsoft.com/office/word/2016/wordml/cid" xmlns:w16="http://schemas.microsoft.com/office/word/2018/wordml" xmlns:w16du="http://schemas.microsoft.com/office/word/2023/wordml/word16du" xmlns:w16sdtdh="http://schemas.microsoft.com/office/word/2020/wordml/sdtdatahash" xmlns:w16sdtfl="http://schemas.microsoft.com/office/word/2024/wordml/sdtformatlock" xmlns:w16se="http://schemas.microsoft.com/office/word/2015/wordml/symex" xmlns:wpg="http://schemas.microsoft.com/office/word/2010/wordprocessingGroup" xmlns:wpi="http://schemas.microsoft.com/office/word/2010/wordprocessingInk" xmlns:wne="http://schemas.microsoft.com/office/word/2006/wordml" xmlns:wps="http://schemas.microsoft.com/office/word/2010/wordprocessingShape" mc:Ignorable="w14 w15 w16se w16cid w16 w16cex w16sdtdh w16sdtfl w16du wp14">
-  <w:abstractNum w:abstractNumId="0" w15:restartNumberingAfterBreak="0">
+<w:numbering xmlns:wpc="http://schemas.microsoft.com/office/word/2010/wordprocessingCanvas" xmlns:mc="http://schemas.openxmlformats.org/markup-compatibility/2006" xmlns:o="urn:schemas-microsoft-com:office:office" xmlns:r="http://schemas.openxmlformats.org/officeDocument/2006/relationships" xmlns:m="http://schemas.openxmlformats.org/officeDocument/2006/math" xmlns:v="urn:schemas-microsoft-com:vml" xmlns:wp14="http://schemas.microsoft.com/office/word/2010/wordprocessingDrawing" xmlns:wp="http://schemas.openxmlformats.org/drawingml/2006/wordprocessingDrawing" xmlns:w10="urn:schemas-microsoft-com:office:word" xmlns:w="http://schemas.openxmlformats.org/wordprocessingml/2006/main" xmlns:w14="http://schemas.microsoft.com/office/word/2010/wordml" xmlns:w15="http://schemas.microsoft.com/office/word/2012/wordml" xmlns:wpg="http://schemas.microsoft.com/office/word/2010/wordprocessingGroup" xmlns:wpi="http://schemas.microsoft.com/office/word/2010/wordprocessingInk" xmlns:wne="http://schemas.microsoft.com/office/word/2006/wordml" xmlns:wps="http://schemas.microsoft.com/office/word/2010/wordprocessingShape" mc:Ignorable="w14 w15 wp14">
+  <w:abstractNum w:abstractNumId="0">
+    <w:nsid w:val="01F82BDC"/>
+    <w:multiLevelType w:val="multilevel"/>
+    <w:tmpl w:val="BA12E41E"/>
+    <w:lvl w:ilvl="0">
+      <w:start w:val="1"/>
+      <w:numFmt w:val="bullet"/>
+      <w:lvlText w:val=""/>
+      <w:lvlJc w:val="left"/>
+      <w:pPr>
+        <w:tabs>
+          <w:tab w:val="num" w:pos="720"/>
+        </w:tabs>
+        <w:ind w:left="720" w:hanging="360"/>
+      </w:pPr>
+      <w:rPr>
+        <w:rFonts w:ascii="Symbol" w:hAnsi="Symbol" w:hint="default"/>
+        <w:sz w:val="20"/>
+      </w:rPr>
+    </w:lvl>
+    <w:lvl w:ilvl="1" w:tentative="1">
+      <w:start w:val="1"/>
+      <w:numFmt w:val="bullet"/>
+      <w:lvlText w:val="o"/>
+      <w:lvlJc w:val="left"/>
+      <w:pPr>
+        <w:tabs>
+          <w:tab w:val="num" w:pos="1440"/>
+        </w:tabs>
+        <w:ind w:left="1440" w:hanging="360"/>
+      </w:pPr>
+      <w:rPr>
+        <w:rFonts w:ascii="Courier New" w:hAnsi="Courier New" w:hint="default"/>
+        <w:sz w:val="20"/>
+      </w:rPr>
+    </w:lvl>
+    <w:lvl w:ilvl="2" w:tentative="1">
+      <w:start w:val="1"/>
+      <w:numFmt w:val="bullet"/>
+      <w:lvlText w:val=""/>
+      <w:lvlJc w:val="left"/>
+      <w:pPr>
+        <w:tabs>
+          <w:tab w:val="num" w:pos="2160"/>
+        </w:tabs>
+        <w:ind w:left="2160" w:hanging="360"/>
+      </w:pPr>
+      <w:rPr>
+        <w:rFonts w:ascii="Wingdings" w:hAnsi="Wingdings" w:hint="default"/>
+        <w:sz w:val="20"/>
+      </w:rPr>
+    </w:lvl>
+    <w:lvl w:ilvl="3" w:tentative="1">
+      <w:start w:val="1"/>
+      <w:numFmt w:val="bullet"/>
+      <w:lvlText w:val=""/>
+      <w:lvlJc w:val="left"/>
+      <w:pPr>
+        <w:tabs>
+          <w:tab w:val="num" w:pos="2880"/>
+        </w:tabs>
+        <w:ind w:left="2880" w:hanging="360"/>
+      </w:pPr>
+      <w:rPr>
+        <w:rFonts w:ascii="Wingdings" w:hAnsi="Wingdings" w:hint="default"/>
+        <w:sz w:val="20"/>
+      </w:rPr>
+    </w:lvl>
+    <w:lvl w:ilvl="4" w:tentative="1">
+      <w:start w:val="1"/>
+      <w:numFmt w:val="bullet"/>
+      <w:lvlText w:val=""/>
+      <w:lvlJc w:val="left"/>
+      <w:pPr>
+        <w:tabs>
+          <w:tab w:val="num" w:pos="3600"/>
+        </w:tabs>
+        <w:ind w:left="3600" w:hanging="360"/>
+      </w:pPr>
+      <w:rPr>
+        <w:rFonts w:ascii="Wingdings" w:hAnsi="Wingdings" w:hint="default"/>
+        <w:sz w:val="20"/>
+      </w:rPr>
+    </w:lvl>
+    <w:lvl w:ilvl="5" w:tentative="1">
+      <w:start w:val="1"/>
+      <w:numFmt w:val="bullet"/>
+      <w:lvlText w:val=""/>
+      <w:lvlJc w:val="left"/>
+      <w:pPr>
+        <w:tabs>
+          <w:tab w:val="num" w:pos="4320"/>
+        </w:tabs>
+        <w:ind w:left="4320" w:hanging="360"/>
+      </w:pPr>
+      <w:rPr>
+        <w:rFonts w:ascii="Wingdings" w:hAnsi="Wingdings" w:hint="default"/>
+        <w:sz w:val="20"/>
+      </w:rPr>
+    </w:lvl>
+    <w:lvl w:ilvl="6" w:tentative="1">
+      <w:start w:val="1"/>
+      <w:numFmt w:val="bullet"/>
+      <w:lvlText w:val=""/>
+      <w:lvlJc w:val="left"/>
+      <w:pPr>
+        <w:tabs>
+          <w:tab w:val="num" w:pos="5040"/>
+        </w:tabs>
+        <w:ind w:left="5040" w:hanging="360"/>
+      </w:pPr>
+      <w:rPr>
+        <w:rFonts w:ascii="Wingdings" w:hAnsi="Wingdings" w:hint="default"/>
+        <w:sz w:val="20"/>
+      </w:rPr>
+    </w:lvl>
+    <w:lvl w:ilvl="7" w:tentative="1">
+      <w:start w:val="1"/>
+      <w:numFmt w:val="bullet"/>
+      <w:lvlText w:val=""/>
+      <w:lvlJc w:val="left"/>
+      <w:pPr>
+        <w:tabs>
+          <w:tab w:val="num" w:pos="5760"/>
+        </w:tabs>
+        <w:ind w:left="5760" w:hanging="360"/>
+      </w:pPr>
+      <w:rPr>
+        <w:rFonts w:ascii="Wingdings" w:hAnsi="Wingdings" w:hint="default"/>
+        <w:sz w:val="20"/>
+      </w:rPr>
+    </w:lvl>
+    <w:lvl w:ilvl="8" w:tentative="1">
+      <w:start w:val="1"/>
+      <w:numFmt w:val="bullet"/>
+      <w:lvlText w:val=""/>
+      <w:lvlJc w:val="left"/>
+      <w:pPr>
+        <w:tabs>
+          <w:tab w:val="num" w:pos="6480"/>
+        </w:tabs>
+        <w:ind w:left="6480" w:hanging="360"/>
+      </w:pPr>
+      <w:rPr>
+        <w:rFonts w:ascii="Wingdings" w:hAnsi="Wingdings" w:hint="default"/>
+        <w:sz w:val="20"/>
+      </w:rPr>
+    </w:lvl>
+  </w:abstractNum>
+  <w:abstractNum w:abstractNumId="1">
     <w:nsid w:val="0511046A"/>
     <w:multiLevelType w:val="multilevel"/>
     <w:tmpl w:val="024C74C6"/>
@@ -2700,7 +3179,305 @@
       </w:rPr>
     </w:lvl>
   </w:abstractNum>
-  <w:abstractNum w:abstractNumId="1" w15:restartNumberingAfterBreak="0">
+  <w:abstractNum w:abstractNumId="2">
+    <w:nsid w:val="0ACB389E"/>
+    <w:multiLevelType w:val="multilevel"/>
+    <w:tmpl w:val="A9A82620"/>
+    <w:lvl w:ilvl="0">
+      <w:start w:val="1"/>
+      <w:numFmt w:val="bullet"/>
+      <w:lvlText w:val=""/>
+      <w:lvlJc w:val="left"/>
+      <w:pPr>
+        <w:tabs>
+          <w:tab w:val="num" w:pos="720"/>
+        </w:tabs>
+        <w:ind w:left="720" w:hanging="360"/>
+      </w:pPr>
+      <w:rPr>
+        <w:rFonts w:ascii="Symbol" w:hAnsi="Symbol" w:hint="default"/>
+        <w:sz w:val="20"/>
+      </w:rPr>
+    </w:lvl>
+    <w:lvl w:ilvl="1" w:tentative="1">
+      <w:start w:val="1"/>
+      <w:numFmt w:val="bullet"/>
+      <w:lvlText w:val="o"/>
+      <w:lvlJc w:val="left"/>
+      <w:pPr>
+        <w:tabs>
+          <w:tab w:val="num" w:pos="1440"/>
+        </w:tabs>
+        <w:ind w:left="1440" w:hanging="360"/>
+      </w:pPr>
+      <w:rPr>
+        <w:rFonts w:ascii="Courier New" w:hAnsi="Courier New" w:hint="default"/>
+        <w:sz w:val="20"/>
+      </w:rPr>
+    </w:lvl>
+    <w:lvl w:ilvl="2" w:tentative="1">
+      <w:start w:val="1"/>
+      <w:numFmt w:val="bullet"/>
+      <w:lvlText w:val=""/>
+      <w:lvlJc w:val="left"/>
+      <w:pPr>
+        <w:tabs>
+          <w:tab w:val="num" w:pos="2160"/>
+        </w:tabs>
+        <w:ind w:left="2160" w:hanging="360"/>
+      </w:pPr>
+      <w:rPr>
+        <w:rFonts w:ascii="Wingdings" w:hAnsi="Wingdings" w:hint="default"/>
+        <w:sz w:val="20"/>
+      </w:rPr>
+    </w:lvl>
+    <w:lvl w:ilvl="3" w:tentative="1">
+      <w:start w:val="1"/>
+      <w:numFmt w:val="bullet"/>
+      <w:lvlText w:val=""/>
+      <w:lvlJc w:val="left"/>
+      <w:pPr>
+        <w:tabs>
+          <w:tab w:val="num" w:pos="2880"/>
+        </w:tabs>
+        <w:ind w:left="2880" w:hanging="360"/>
+      </w:pPr>
+      <w:rPr>
+        <w:rFonts w:ascii="Wingdings" w:hAnsi="Wingdings" w:hint="default"/>
+        <w:sz w:val="20"/>
+      </w:rPr>
+    </w:lvl>
+    <w:lvl w:ilvl="4" w:tentative="1">
+      <w:start w:val="1"/>
+      <w:numFmt w:val="bullet"/>
+      <w:lvlText w:val=""/>
+      <w:lvlJc w:val="left"/>
+      <w:pPr>
+        <w:tabs>
+          <w:tab w:val="num" w:pos="3600"/>
+        </w:tabs>
+        <w:ind w:left="3600" w:hanging="360"/>
+      </w:pPr>
+      <w:rPr>
+        <w:rFonts w:ascii="Wingdings" w:hAnsi="Wingdings" w:hint="default"/>
+        <w:sz w:val="20"/>
+      </w:rPr>
+    </w:lvl>
+    <w:lvl w:ilvl="5" w:tentative="1">
+      <w:start w:val="1"/>
+      <w:numFmt w:val="bullet"/>
+      <w:lvlText w:val=""/>
+      <w:lvlJc w:val="left"/>
+      <w:pPr>
+        <w:tabs>
+          <w:tab w:val="num" w:pos="4320"/>
+        </w:tabs>
+        <w:ind w:left="4320" w:hanging="360"/>
+      </w:pPr>
+      <w:rPr>
+        <w:rFonts w:ascii="Wingdings" w:hAnsi="Wingdings" w:hint="default"/>
+        <w:sz w:val="20"/>
+      </w:rPr>
+    </w:lvl>
+    <w:lvl w:ilvl="6" w:tentative="1">
+      <w:start w:val="1"/>
+      <w:numFmt w:val="bullet"/>
+      <w:lvlText w:val=""/>
+      <w:lvlJc w:val="left"/>
+      <w:pPr>
+        <w:tabs>
+          <w:tab w:val="num" w:pos="5040"/>
+        </w:tabs>
+        <w:ind w:left="5040" w:hanging="360"/>
+      </w:pPr>
+      <w:rPr>
+        <w:rFonts w:ascii="Wingdings" w:hAnsi="Wingdings" w:hint="default"/>
+        <w:sz w:val="20"/>
+      </w:rPr>
+    </w:lvl>
+    <w:lvl w:ilvl="7" w:tentative="1">
+      <w:start w:val="1"/>
+      <w:numFmt w:val="bullet"/>
+      <w:lvlText w:val=""/>
+      <w:lvlJc w:val="left"/>
+      <w:pPr>
+        <w:tabs>
+          <w:tab w:val="num" w:pos="5760"/>
+        </w:tabs>
+        <w:ind w:left="5760" w:hanging="360"/>
+      </w:pPr>
+      <w:rPr>
+        <w:rFonts w:ascii="Wingdings" w:hAnsi="Wingdings" w:hint="default"/>
+        <w:sz w:val="20"/>
+      </w:rPr>
+    </w:lvl>
+    <w:lvl w:ilvl="8" w:tentative="1">
+      <w:start w:val="1"/>
+      <w:numFmt w:val="bullet"/>
+      <w:lvlText w:val=""/>
+      <w:lvlJc w:val="left"/>
+      <w:pPr>
+        <w:tabs>
+          <w:tab w:val="num" w:pos="6480"/>
+        </w:tabs>
+        <w:ind w:left="6480" w:hanging="360"/>
+      </w:pPr>
+      <w:rPr>
+        <w:rFonts w:ascii="Wingdings" w:hAnsi="Wingdings" w:hint="default"/>
+        <w:sz w:val="20"/>
+      </w:rPr>
+    </w:lvl>
+  </w:abstractNum>
+  <w:abstractNum w:abstractNumId="3">
+    <w:nsid w:val="1BB41187"/>
+    <w:multiLevelType w:val="multilevel"/>
+    <w:tmpl w:val="1AE2B494"/>
+    <w:lvl w:ilvl="0">
+      <w:start w:val="1"/>
+      <w:numFmt w:val="bullet"/>
+      <w:lvlText w:val=""/>
+      <w:lvlJc w:val="left"/>
+      <w:pPr>
+        <w:tabs>
+          <w:tab w:val="num" w:pos="720"/>
+        </w:tabs>
+        <w:ind w:left="720" w:hanging="360"/>
+      </w:pPr>
+      <w:rPr>
+        <w:rFonts w:ascii="Symbol" w:hAnsi="Symbol" w:hint="default"/>
+        <w:sz w:val="20"/>
+      </w:rPr>
+    </w:lvl>
+    <w:lvl w:ilvl="1">
+      <w:start w:val="1"/>
+      <w:numFmt w:val="bullet"/>
+      <w:lvlText w:val="o"/>
+      <w:lvlJc w:val="left"/>
+      <w:pPr>
+        <w:tabs>
+          <w:tab w:val="num" w:pos="1440"/>
+        </w:tabs>
+        <w:ind w:left="1440" w:hanging="360"/>
+      </w:pPr>
+      <w:rPr>
+        <w:rFonts w:ascii="Courier New" w:hAnsi="Courier New" w:hint="default"/>
+        <w:sz w:val="20"/>
+      </w:rPr>
+    </w:lvl>
+    <w:lvl w:ilvl="2" w:tentative="1">
+      <w:start w:val="1"/>
+      <w:numFmt w:val="bullet"/>
+      <w:lvlText w:val=""/>
+      <w:lvlJc w:val="left"/>
+      <w:pPr>
+        <w:tabs>
+          <w:tab w:val="num" w:pos="2160"/>
+        </w:tabs>
+        <w:ind w:left="2160" w:hanging="360"/>
+      </w:pPr>
+      <w:rPr>
+        <w:rFonts w:ascii="Wingdings" w:hAnsi="Wingdings" w:hint="default"/>
+        <w:sz w:val="20"/>
+      </w:rPr>
+    </w:lvl>
+    <w:lvl w:ilvl="3" w:tentative="1">
+      <w:start w:val="1"/>
+      <w:numFmt w:val="bullet"/>
+      <w:lvlText w:val=""/>
+      <w:lvlJc w:val="left"/>
+      <w:pPr>
+        <w:tabs>
+          <w:tab w:val="num" w:pos="2880"/>
+        </w:tabs>
+        <w:ind w:left="2880" w:hanging="360"/>
+      </w:pPr>
+      <w:rPr>
+        <w:rFonts w:ascii="Wingdings" w:hAnsi="Wingdings" w:hint="default"/>
+        <w:sz w:val="20"/>
+      </w:rPr>
+    </w:lvl>
+    <w:lvl w:ilvl="4" w:tentative="1">
+      <w:start w:val="1"/>
+      <w:numFmt w:val="bullet"/>
+      <w:lvlText w:val=""/>
+      <w:lvlJc w:val="left"/>
+      <w:pPr>
+        <w:tabs>
+          <w:tab w:val="num" w:pos="3600"/>
+        </w:tabs>
+        <w:ind w:left="3600" w:hanging="360"/>
+      </w:pPr>
+      <w:rPr>
+        <w:rFonts w:ascii="Wingdings" w:hAnsi="Wingdings" w:hint="default"/>
+        <w:sz w:val="20"/>
+      </w:rPr>
+    </w:lvl>
+    <w:lvl w:ilvl="5" w:tentative="1">
+      <w:start w:val="1"/>
+      <w:numFmt w:val="bullet"/>
+      <w:lvlText w:val=""/>
+      <w:lvlJc w:val="left"/>
+      <w:pPr>
+        <w:tabs>
+          <w:tab w:val="num" w:pos="4320"/>
+        </w:tabs>
+        <w:ind w:left="4320" w:hanging="360"/>
+      </w:pPr>
+      <w:rPr>
+        <w:rFonts w:ascii="Wingdings" w:hAnsi="Wingdings" w:hint="default"/>
+        <w:sz w:val="20"/>
+      </w:rPr>
+    </w:lvl>
+    <w:lvl w:ilvl="6" w:tentative="1">
+      <w:start w:val="1"/>
+      <w:numFmt w:val="bullet"/>
+      <w:lvlText w:val=""/>
+      <w:lvlJc w:val="left"/>
+      <w:pPr>
+        <w:tabs>
+          <w:tab w:val="num" w:pos="5040"/>
+        </w:tabs>
+        <w:ind w:left="5040" w:hanging="360"/>
+      </w:pPr>
+      <w:rPr>
+        <w:rFonts w:ascii="Wingdings" w:hAnsi="Wingdings" w:hint="default"/>
+        <w:sz w:val="20"/>
+      </w:rPr>
+    </w:lvl>
+    <w:lvl w:ilvl="7" w:tentative="1">
+      <w:start w:val="1"/>
+      <w:numFmt w:val="bullet"/>
+      <w:lvlText w:val=""/>
+      <w:lvlJc w:val="left"/>
+      <w:pPr>
+        <w:tabs>
+          <w:tab w:val="num" w:pos="5760"/>
+        </w:tabs>
+        <w:ind w:left="5760" w:hanging="360"/>
+      </w:pPr>
+      <w:rPr>
+        <w:rFonts w:ascii="Wingdings" w:hAnsi="Wingdings" w:hint="default"/>
+        <w:sz w:val="20"/>
+      </w:rPr>
+    </w:lvl>
+    <w:lvl w:ilvl="8" w:tentative="1">
+      <w:start w:val="1"/>
+      <w:numFmt w:val="bullet"/>
+      <w:lvlText w:val=""/>
+      <w:lvlJc w:val="left"/>
+      <w:pPr>
+        <w:tabs>
+          <w:tab w:val="num" w:pos="6480"/>
+        </w:tabs>
+        <w:ind w:left="6480" w:hanging="360"/>
+      </w:pPr>
+      <w:rPr>
+        <w:rFonts w:ascii="Wingdings" w:hAnsi="Wingdings" w:hint="default"/>
+        <w:sz w:val="20"/>
+      </w:rPr>
+    </w:lvl>
+  </w:abstractNum>
+  <w:abstractNum w:abstractNumId="4">
     <w:nsid w:val="2EFE74C5"/>
     <w:multiLevelType w:val="multilevel"/>
     <w:tmpl w:val="E30E2CCC"/>
@@ -2849,17 +3626,330 @@
       </w:rPr>
     </w:lvl>
   </w:abstractNum>
-  <w:num w:numId="1" w16cid:durableId="160783125">
+  <w:abstractNum w:abstractNumId="5">
+    <w:nsid w:val="757D1B8C"/>
+    <w:multiLevelType w:val="multilevel"/>
+    <w:tmpl w:val="03809F70"/>
+    <w:lvl w:ilvl="0">
+      <w:start w:val="1"/>
+      <w:numFmt w:val="bullet"/>
+      <w:lvlText w:val=""/>
+      <w:lvlJc w:val="left"/>
+      <w:pPr>
+        <w:tabs>
+          <w:tab w:val="num" w:pos="720"/>
+        </w:tabs>
+        <w:ind w:left="720" w:hanging="360"/>
+      </w:pPr>
+      <w:rPr>
+        <w:rFonts w:ascii="Symbol" w:hAnsi="Symbol" w:hint="default"/>
+        <w:sz w:val="20"/>
+      </w:rPr>
+    </w:lvl>
+    <w:lvl w:ilvl="1" w:tentative="1">
+      <w:start w:val="1"/>
+      <w:numFmt w:val="bullet"/>
+      <w:lvlText w:val="o"/>
+      <w:lvlJc w:val="left"/>
+      <w:pPr>
+        <w:tabs>
+          <w:tab w:val="num" w:pos="1440"/>
+        </w:tabs>
+        <w:ind w:left="1440" w:hanging="360"/>
+      </w:pPr>
+      <w:rPr>
+        <w:rFonts w:ascii="Courier New" w:hAnsi="Courier New" w:hint="default"/>
+        <w:sz w:val="20"/>
+      </w:rPr>
+    </w:lvl>
+    <w:lvl w:ilvl="2" w:tentative="1">
+      <w:start w:val="1"/>
+      <w:numFmt w:val="bullet"/>
+      <w:lvlText w:val=""/>
+      <w:lvlJc w:val="left"/>
+      <w:pPr>
+        <w:tabs>
+          <w:tab w:val="num" w:pos="2160"/>
+        </w:tabs>
+        <w:ind w:left="2160" w:hanging="360"/>
+      </w:pPr>
+      <w:rPr>
+        <w:rFonts w:ascii="Wingdings" w:hAnsi="Wingdings" w:hint="default"/>
+        <w:sz w:val="20"/>
+      </w:rPr>
+    </w:lvl>
+    <w:lvl w:ilvl="3" w:tentative="1">
+      <w:start w:val="1"/>
+      <w:numFmt w:val="bullet"/>
+      <w:lvlText w:val=""/>
+      <w:lvlJc w:val="left"/>
+      <w:pPr>
+        <w:tabs>
+          <w:tab w:val="num" w:pos="2880"/>
+        </w:tabs>
+        <w:ind w:left="2880" w:hanging="360"/>
+      </w:pPr>
+      <w:rPr>
+        <w:rFonts w:ascii="Wingdings" w:hAnsi="Wingdings" w:hint="default"/>
+        <w:sz w:val="20"/>
+      </w:rPr>
+    </w:lvl>
+    <w:lvl w:ilvl="4" w:tentative="1">
+      <w:start w:val="1"/>
+      <w:numFmt w:val="bullet"/>
+      <w:lvlText w:val=""/>
+      <w:lvlJc w:val="left"/>
+      <w:pPr>
+        <w:tabs>
+          <w:tab w:val="num" w:pos="3600"/>
+        </w:tabs>
+        <w:ind w:left="3600" w:hanging="360"/>
+      </w:pPr>
+      <w:rPr>
+        <w:rFonts w:ascii="Wingdings" w:hAnsi="Wingdings" w:hint="default"/>
+        <w:sz w:val="20"/>
+      </w:rPr>
+    </w:lvl>
+    <w:lvl w:ilvl="5" w:tentative="1">
+      <w:start w:val="1"/>
+      <w:numFmt w:val="bullet"/>
+      <w:lvlText w:val=""/>
+      <w:lvlJc w:val="left"/>
+      <w:pPr>
+        <w:tabs>
+          <w:tab w:val="num" w:pos="4320"/>
+        </w:tabs>
+        <w:ind w:left="4320" w:hanging="360"/>
+      </w:pPr>
+      <w:rPr>
+        <w:rFonts w:ascii="Wingdings" w:hAnsi="Wingdings" w:hint="default"/>
+        <w:sz w:val="20"/>
+      </w:rPr>
+    </w:lvl>
+    <w:lvl w:ilvl="6" w:tentative="1">
+      <w:start w:val="1"/>
+      <w:numFmt w:val="bullet"/>
+      <w:lvlText w:val=""/>
+      <w:lvlJc w:val="left"/>
+      <w:pPr>
+        <w:tabs>
+          <w:tab w:val="num" w:pos="5040"/>
+        </w:tabs>
+        <w:ind w:left="5040" w:hanging="360"/>
+      </w:pPr>
+      <w:rPr>
+        <w:rFonts w:ascii="Wingdings" w:hAnsi="Wingdings" w:hint="default"/>
+        <w:sz w:val="20"/>
+      </w:rPr>
+    </w:lvl>
+    <w:lvl w:ilvl="7" w:tentative="1">
+      <w:start w:val="1"/>
+      <w:numFmt w:val="bullet"/>
+      <w:lvlText w:val=""/>
+      <w:lvlJc w:val="left"/>
+      <w:pPr>
+        <w:tabs>
+          <w:tab w:val="num" w:pos="5760"/>
+        </w:tabs>
+        <w:ind w:left="5760" w:hanging="360"/>
+      </w:pPr>
+      <w:rPr>
+        <w:rFonts w:ascii="Wingdings" w:hAnsi="Wingdings" w:hint="default"/>
+        <w:sz w:val="20"/>
+      </w:rPr>
+    </w:lvl>
+    <w:lvl w:ilvl="8" w:tentative="1">
+      <w:start w:val="1"/>
+      <w:numFmt w:val="bullet"/>
+      <w:lvlText w:val=""/>
+      <w:lvlJc w:val="left"/>
+      <w:pPr>
+        <w:tabs>
+          <w:tab w:val="num" w:pos="6480"/>
+        </w:tabs>
+        <w:ind w:left="6480" w:hanging="360"/>
+      </w:pPr>
+      <w:rPr>
+        <w:rFonts w:ascii="Wingdings" w:hAnsi="Wingdings" w:hint="default"/>
+        <w:sz w:val="20"/>
+      </w:rPr>
+    </w:lvl>
+  </w:abstractNum>
+  <w:abstractNum w:abstractNumId="6">
+    <w:nsid w:val="7B204768"/>
+    <w:multiLevelType w:val="multilevel"/>
+    <w:tmpl w:val="4D6467E6"/>
+    <w:lvl w:ilvl="0">
+      <w:start w:val="1"/>
+      <w:numFmt w:val="bullet"/>
+      <w:lvlText w:val=""/>
+      <w:lvlJc w:val="left"/>
+      <w:pPr>
+        <w:tabs>
+          <w:tab w:val="num" w:pos="720"/>
+        </w:tabs>
+        <w:ind w:left="720" w:hanging="360"/>
+      </w:pPr>
+      <w:rPr>
+        <w:rFonts w:ascii="Symbol" w:hAnsi="Symbol" w:hint="default"/>
+        <w:sz w:val="20"/>
+      </w:rPr>
+    </w:lvl>
+    <w:lvl w:ilvl="1">
+      <w:start w:val="1"/>
+      <w:numFmt w:val="bullet"/>
+      <w:lvlText w:val="o"/>
+      <w:lvlJc w:val="left"/>
+      <w:pPr>
+        <w:tabs>
+          <w:tab w:val="num" w:pos="1440"/>
+        </w:tabs>
+        <w:ind w:left="1440" w:hanging="360"/>
+      </w:pPr>
+      <w:rPr>
+        <w:rFonts w:ascii="Courier New" w:hAnsi="Courier New" w:hint="default"/>
+        <w:sz w:val="20"/>
+      </w:rPr>
+    </w:lvl>
+    <w:lvl w:ilvl="2" w:tentative="1">
+      <w:start w:val="1"/>
+      <w:numFmt w:val="bullet"/>
+      <w:lvlText w:val=""/>
+      <w:lvlJc w:val="left"/>
+      <w:pPr>
+        <w:tabs>
+          <w:tab w:val="num" w:pos="2160"/>
+        </w:tabs>
+        <w:ind w:left="2160" w:hanging="360"/>
+      </w:pPr>
+      <w:rPr>
+        <w:rFonts w:ascii="Wingdings" w:hAnsi="Wingdings" w:hint="default"/>
+        <w:sz w:val="20"/>
+      </w:rPr>
+    </w:lvl>
+    <w:lvl w:ilvl="3" w:tentative="1">
+      <w:start w:val="1"/>
+      <w:numFmt w:val="bullet"/>
+      <w:lvlText w:val=""/>
+      <w:lvlJc w:val="left"/>
+      <w:pPr>
+        <w:tabs>
+          <w:tab w:val="num" w:pos="2880"/>
+        </w:tabs>
+        <w:ind w:left="2880" w:hanging="360"/>
+      </w:pPr>
+      <w:rPr>
+        <w:rFonts w:ascii="Wingdings" w:hAnsi="Wingdings" w:hint="default"/>
+        <w:sz w:val="20"/>
+      </w:rPr>
+    </w:lvl>
+    <w:lvl w:ilvl="4" w:tentative="1">
+      <w:start w:val="1"/>
+      <w:numFmt w:val="bullet"/>
+      <w:lvlText w:val=""/>
+      <w:lvlJc w:val="left"/>
+      <w:pPr>
+        <w:tabs>
+          <w:tab w:val="num" w:pos="3600"/>
+        </w:tabs>
+        <w:ind w:left="3600" w:hanging="360"/>
+      </w:pPr>
+      <w:rPr>
+        <w:rFonts w:ascii="Wingdings" w:hAnsi="Wingdings" w:hint="default"/>
+        <w:sz w:val="20"/>
+      </w:rPr>
+    </w:lvl>
+    <w:lvl w:ilvl="5" w:tentative="1">
+      <w:start w:val="1"/>
+      <w:numFmt w:val="bullet"/>
+      <w:lvlText w:val=""/>
+      <w:lvlJc w:val="left"/>
+      <w:pPr>
+        <w:tabs>
+          <w:tab w:val="num" w:pos="4320"/>
+        </w:tabs>
+        <w:ind w:left="4320" w:hanging="360"/>
+      </w:pPr>
+      <w:rPr>
+        <w:rFonts w:ascii="Wingdings" w:hAnsi="Wingdings" w:hint="default"/>
+        <w:sz w:val="20"/>
+      </w:rPr>
+    </w:lvl>
+    <w:lvl w:ilvl="6" w:tentative="1">
+      <w:start w:val="1"/>
+      <w:numFmt w:val="bullet"/>
+      <w:lvlText w:val=""/>
+      <w:lvlJc w:val="left"/>
+      <w:pPr>
+        <w:tabs>
+          <w:tab w:val="num" w:pos="5040"/>
+        </w:tabs>
+        <w:ind w:left="5040" w:hanging="360"/>
+      </w:pPr>
+      <w:rPr>
+        <w:rFonts w:ascii="Wingdings" w:hAnsi="Wingdings" w:hint="default"/>
+        <w:sz w:val="20"/>
+      </w:rPr>
+    </w:lvl>
+    <w:lvl w:ilvl="7" w:tentative="1">
+      <w:start w:val="1"/>
+      <w:numFmt w:val="bullet"/>
+      <w:lvlText w:val=""/>
+      <w:lvlJc w:val="left"/>
+      <w:pPr>
+        <w:tabs>
+          <w:tab w:val="num" w:pos="5760"/>
+        </w:tabs>
+        <w:ind w:left="5760" w:hanging="360"/>
+      </w:pPr>
+      <w:rPr>
+        <w:rFonts w:ascii="Wingdings" w:hAnsi="Wingdings" w:hint="default"/>
+        <w:sz w:val="20"/>
+      </w:rPr>
+    </w:lvl>
+    <w:lvl w:ilvl="8" w:tentative="1">
+      <w:start w:val="1"/>
+      <w:numFmt w:val="bullet"/>
+      <w:lvlText w:val=""/>
+      <w:lvlJc w:val="left"/>
+      <w:pPr>
+        <w:tabs>
+          <w:tab w:val="num" w:pos="6480"/>
+        </w:tabs>
+        <w:ind w:left="6480" w:hanging="360"/>
+      </w:pPr>
+      <w:rPr>
+        <w:rFonts w:ascii="Wingdings" w:hAnsi="Wingdings" w:hint="default"/>
+        <w:sz w:val="20"/>
+      </w:rPr>
+    </w:lvl>
+  </w:abstractNum>
+  <w:num w:numId="1">
+    <w:abstractNumId w:val="4"/>
+  </w:num>
+  <w:num w:numId="2">
     <w:abstractNumId w:val="1"/>
   </w:num>
-  <w:num w:numId="2" w16cid:durableId="1124736243">
+  <w:num w:numId="3">
+    <w:abstractNumId w:val="5"/>
+  </w:num>
+  <w:num w:numId="4">
+    <w:abstractNumId w:val="3"/>
+  </w:num>
+  <w:num w:numId="5">
     <w:abstractNumId w:val="0"/>
+  </w:num>
+  <w:num w:numId="6">
+    <w:abstractNumId w:val="2"/>
+  </w:num>
+  <w:num w:numId="7">
+    <w:abstractNumId w:val="6"/>
   </w:num>
 </w:numbering>
 </file>
 
 <file path=word/styles.xml><?xml version="1.0" encoding="utf-8"?>
-<w:styles xmlns:mc="http://schemas.openxmlformats.org/markup-compatibility/2006" xmlns:r="http://schemas.openxmlformats.org/officeDocument/2006/relationships" xmlns:w="http://schemas.openxmlformats.org/wordprocessingml/2006/main" xmlns:w14="http://schemas.microsoft.com/office/word/2010/wordml" xmlns:w15="http://schemas.microsoft.com/office/word/2012/wordml" xmlns:w16cex="http://schemas.microsoft.com/office/word/2018/wordml/cex" xmlns:w16cid="http://schemas.microsoft.com/office/word/2016/wordml/cid" xmlns:w16="http://schemas.microsoft.com/office/word/2018/wordml" xmlns:w16du="http://schemas.microsoft.com/office/word/2023/wordml/word16du" xmlns:w16sdtdh="http://schemas.microsoft.com/office/word/2020/wordml/sdtdatahash" xmlns:w16sdtfl="http://schemas.microsoft.com/office/word/2024/wordml/sdtformatlock" xmlns:w16se="http://schemas.microsoft.com/office/word/2015/wordml/symex" mc:Ignorable="w14 w15 w16se w16cid w16 w16cex w16sdtdh w16sdtfl w16du">
+<w:styles xmlns:mc="http://schemas.openxmlformats.org/markup-compatibility/2006" xmlns:r="http://schemas.openxmlformats.org/officeDocument/2006/relationships" xmlns:w="http://schemas.openxmlformats.org/wordprocessingml/2006/main" xmlns:w14="http://schemas.microsoft.com/office/word/2010/wordml" xmlns:w15="http://schemas.microsoft.com/office/word/2012/wordml" mc:Ignorable="w14 w15">
   <w:docDefaults>
     <w:rPrDefault>
       <w:rPr>
@@ -2877,7 +3967,7 @@
       </w:pPr>
     </w:pPrDefault>
   </w:docDefaults>
-  <w:latentStyles w:defLockedState="0" w:defUIPriority="99" w:defSemiHidden="0" w:defUnhideWhenUsed="0" w:defQFormat="0" w:count="376">
+  <w:latentStyles w:defLockedState="0" w:defUIPriority="99" w:defSemiHidden="0" w:defUnhideWhenUsed="0" w:defQFormat="0" w:count="371">
     <w:lsdException w:name="Normal" w:uiPriority="0" w:qFormat="1"/>
     <w:lsdException w:name="heading 1" w:uiPriority="9" w:qFormat="1"/>
     <w:lsdException w:name="heading 2" w:semiHidden="1" w:uiPriority="9" w:unhideWhenUsed="1" w:qFormat="1"/>
@@ -3249,11 +4339,6 @@
     <w:lsdException w:name="List Table 5 Dark Accent 6" w:uiPriority="50"/>
     <w:lsdException w:name="List Table 6 Colorful Accent 6" w:uiPriority="51"/>
     <w:lsdException w:name="List Table 7 Colorful Accent 6" w:uiPriority="52"/>
-    <w:lsdException w:name="Mention" w:semiHidden="1" w:unhideWhenUsed="1"/>
-    <w:lsdException w:name="Smart Hyperlink" w:semiHidden="1" w:unhideWhenUsed="1"/>
-    <w:lsdException w:name="Hashtag" w:semiHidden="1" w:unhideWhenUsed="1"/>
-    <w:lsdException w:name="Unresolved Mention" w:semiHidden="1" w:unhideWhenUsed="1"/>
-    <w:lsdException w:name="Smart Link" w:semiHidden="1" w:unhideWhenUsed="1"/>
   </w:latentStyles>
   <w:style w:type="paragraph" w:default="1" w:styleId="Normal">
     <w:name w:val="Normal"/>
@@ -3307,9 +4392,33 @@
       <w:szCs w:val="24"/>
     </w:rPr>
   </w:style>
+  <w:style w:type="paragraph" w:styleId="Heading4">
+    <w:name w:val="heading 4"/>
+    <w:basedOn w:val="Normal"/>
+    <w:next w:val="Normal"/>
+    <w:link w:val="Heading4Char"/>
+    <w:uiPriority w:val="9"/>
+    <w:semiHidden/>
+    <w:unhideWhenUsed/>
+    <w:qFormat/>
+    <w:rsid w:val="002717A5"/>
+    <w:pPr>
+      <w:keepNext/>
+      <w:keepLines/>
+      <w:spacing w:before="40" w:after="0"/>
+      <w:outlineLvl w:val="3"/>
+    </w:pPr>
+    <w:rPr>
+      <w:rFonts w:asciiTheme="majorHAnsi" w:eastAsiaTheme="majorEastAsia" w:hAnsiTheme="majorHAnsi" w:cstheme="majorBidi"/>
+      <w:i/>
+      <w:iCs/>
+      <w:color w:val="2F5496" w:themeColor="accent1" w:themeShade="BF"/>
+    </w:rPr>
+  </w:style>
   <w:style w:type="character" w:default="1" w:styleId="DefaultParagraphFont">
     <w:name w:val="Default Paragraph Font"/>
     <w:uiPriority w:val="1"/>
+    <w:semiHidden/>
     <w:unhideWhenUsed/>
   </w:style>
   <w:style w:type="table" w:default="1" w:styleId="TableNormal">
@@ -3507,6 +4616,20 @@
     <w:link w:val="Footer"/>
     <w:uiPriority w:val="99"/>
     <w:rsid w:val="00774CB5"/>
+  </w:style>
+  <w:style w:type="character" w:customStyle="1" w:styleId="Heading4Char">
+    <w:name w:val="Heading 4 Char"/>
+    <w:basedOn w:val="DefaultParagraphFont"/>
+    <w:link w:val="Heading4"/>
+    <w:uiPriority w:val="9"/>
+    <w:semiHidden/>
+    <w:rsid w:val="002717A5"/>
+    <w:rPr>
+      <w:rFonts w:asciiTheme="majorHAnsi" w:eastAsiaTheme="majorEastAsia" w:hAnsiTheme="majorHAnsi" w:cstheme="majorBidi"/>
+      <w:i/>
+      <w:iCs/>
+      <w:color w:val="2F5496" w:themeColor="accent1" w:themeShade="BF"/>
+    </w:rPr>
   </w:style>
 </w:styles>
 </file>

</xml_diff>